<commit_message>
Update `Operating Systems`/Update `Oral Communications`
</commit_message>
<xml_diff>
--- a/Operating Systems.docx
+++ b/Operating Systems.docx
@@ -2610,6 +2610,109 @@
       </w:pPr>
       <w:r>
         <w:rPr/>
+        <w:t>Peterson’s Solution (page 73)</w:t>
+      </w:r>
+    </w:p>
+    <w:p>
+      <w:pPr>
+        <w:pStyle w:val="Normal"/>
+        <w:widowControl/>
+        <w:suppressAutoHyphens w:val="true"/>
+        <w:bidi w:val="0"/>
+        <w:spacing w:lineRule="auto" w:line="259" w:before="0" w:after="160"/>
+        <w:ind w:hanging="0" w:left="720" w:right="0"/>
+        <w:jc w:val="left"/>
+        <w:rPr/>
+      </w:pPr>
+      <w:r>
+        <w:rPr/>
+        <w:t>when two processes attempt to access critical code at the same time, only the process that first sets the turn variable will access the code</w:t>
+      </w:r>
+    </w:p>
+    <w:p>
+      <w:pPr>
+        <w:pStyle w:val="Normal"/>
+        <w:widowControl/>
+        <w:suppressAutoHyphens w:val="true"/>
+        <w:bidi w:val="0"/>
+        <w:spacing w:lineRule="auto" w:line="259" w:before="0" w:after="160"/>
+        <w:ind w:hanging="0" w:left="720" w:right="0"/>
+        <w:jc w:val="left"/>
+        <w:rPr/>
+      </w:pPr>
+      <w:r>
+        <w:rPr/>
+        <w:t>mutual exclusion</w:t>
+      </w:r>
+    </w:p>
+    <w:p>
+      <w:pPr>
+        <w:pStyle w:val="Normal"/>
+        <w:widowControl/>
+        <w:suppressAutoHyphens w:val="true"/>
+        <w:bidi w:val="0"/>
+        <w:spacing w:lineRule="auto" w:line="259" w:before="0" w:after="160"/>
+        <w:ind w:hanging="0" w:left="720" w:right="0"/>
+        <w:jc w:val="left"/>
+        <w:rPr/>
+      </w:pPr>
+      <w:r>
+        <w:rPr/>
+        <w:t>not used by modern operating system</w:t>
+      </w:r>
+    </w:p>
+    <w:p>
+      <w:pPr>
+        <w:pStyle w:val="Normal"/>
+        <w:spacing w:before="0" w:after="160"/>
+        <w:rPr/>
+      </w:pPr>
+      <w:r>
+        <w:rPr/>
+        <w:t>The TSL Instruction (page 75)</w:t>
+      </w:r>
+    </w:p>
+    <w:p>
+      <w:pPr>
+        <w:pStyle w:val="Normal"/>
+        <w:widowControl/>
+        <w:suppressAutoHyphens w:val="true"/>
+        <w:bidi w:val="0"/>
+        <w:spacing w:lineRule="auto" w:line="259" w:before="0" w:after="160"/>
+        <w:ind w:hanging="0" w:left="720" w:right="0"/>
+        <w:jc w:val="left"/>
+        <w:rPr/>
+      </w:pPr>
+      <w:r>
+        <w:rPr/>
+        <w:t>set a register to 1</w:t>
+      </w:r>
+    </w:p>
+    <w:p>
+      <w:pPr>
+        <w:pStyle w:val="Normal"/>
+        <w:widowControl/>
+        <w:suppressAutoHyphens w:val="true"/>
+        <w:bidi w:val="0"/>
+        <w:spacing w:lineRule="auto" w:line="259" w:before="0" w:after="160"/>
+        <w:ind w:hanging="0" w:left="720" w:right="0"/>
+        <w:jc w:val="left"/>
+        <w:rPr/>
+      </w:pPr>
+      <w:r>
+        <w:rPr/>
+        <w:t>while set to 1, someone else has the critical code</w:t>
+      </w:r>
+    </w:p>
+    <w:p>
+      <w:pPr>
+        <w:pStyle w:val="Normal"/>
+        <w:spacing w:before="0" w:after="160"/>
+        <w:rPr/>
+      </w:pPr>
+      <w:r>
+        <w:rPr/>
+        <w:t>busy waiting</w:t>
       </w:r>
     </w:p>
     <w:sectPr>

</xml_diff>